<commit_message>
HB-FY24 final: label the bracketed interval as the 95% confidence interval of the difference
The interval after a policy − Human baseline difference was labelled
'[95% 구간]' right after 'Human baseline', which could be read as an
interval of the Human baseline score. Comparison document table 3 now
shows the mean difference and its 95% confidence interval on separate
rows; thesis table 7-6 and appendix F-3, the 15-page summary table 6,
the results summary and slide 15 name it as the interval of the
difference. No values changed.
</commit_message>
<xml_diff>
--- a/human_baseline_final_20261019/01_미팅자료_20261019/LLM_HumanBaseline_비교_20261019.docx
+++ b/human_baseline_final_20261019/01_미팅자료_20261019/LLM_HumanBaseline_비교_20261019.docx
@@ -1071,7 +1071,7 @@
               <w:rPr>
                 <w:sz w:val="18"/>
               </w:rPr>
-              <w:t>차이: C4 − Human baseline [95% 구간]</w:t>
+              <w:t>평균 차이: C4 − Human baseline</w:t>
             </w:r>
           </w:p>
         </w:tc>
@@ -1094,7 +1094,7 @@
               <w:rPr>
                 <w:sz w:val="18"/>
               </w:rPr>
-              <w:t>+0.219 [−0.138, +0.607]</w:t>
+              <w:t>+0.219</w:t>
             </w:r>
           </w:p>
         </w:tc>
@@ -1117,7 +1117,7 @@
               <w:rPr>
                 <w:sz w:val="18"/>
               </w:rPr>
-              <w:t>+0.124 [−0.341, +0.586]</w:t>
+              <w:t>+0.124</w:t>
             </w:r>
           </w:p>
         </w:tc>
@@ -1144,7 +1144,7 @@
               <w:rPr>
                 <w:sz w:val="18"/>
               </w:rPr>
-              <w:t>차이: C6-E − Human baseline [95% 구간]</w:t>
+              <w:t xml:space="preserve">    차이의 95% 신뢰구간</w:t>
             </w:r>
           </w:p>
         </w:tc>
@@ -1167,7 +1167,7 @@
               <w:rPr>
                 <w:sz w:val="18"/>
               </w:rPr>
-              <w:t>+0.182 [−0.282, +0.649]</w:t>
+              <w:t>[−0.138, +0.607]</w:t>
             </w:r>
           </w:p>
         </w:tc>
@@ -1190,7 +1190,153 @@
               <w:rPr>
                 <w:sz w:val="18"/>
               </w:rPr>
-              <w:t>+0.138 [−0.321, +0.599]</w:t>
+              <w:t>[−0.341, +0.586]</w:t>
+            </w:r>
+          </w:p>
+        </w:tc>
+      </w:tr>
+      <w:tr>
+        <w:trPr>
+          <w:jc w:val="center"/>
+        </w:trPr>
+        <w:tc>
+          <w:tcPr>
+            <w:tcW w:w="3742" w:type="dxa"/>
+            <w:tcBorders>
+              <w:left w:val="nil"/>
+              <w:bottom w:val="nil"/>
+              <w:right w:val="nil"/>
+            </w:tcBorders>
+          </w:tcPr>
+          <w:p>
+            <w:pPr>
+              <w:keepNext/>
+              <w:spacing w:before="30" w:after="30"/>
+            </w:pPr>
+            <w:r>
+              <w:rPr>
+                <w:sz w:val="18"/>
+              </w:rPr>
+              <w:t>평균 차이: C6-E − Human baseline</w:t>
+            </w:r>
+          </w:p>
+        </w:tc>
+        <w:tc>
+          <w:tcPr>
+            <w:tcW w:w="2948" w:type="dxa"/>
+            <w:tcBorders>
+              <w:left w:val="nil"/>
+              <w:bottom w:val="nil"/>
+              <w:right w:val="nil"/>
+            </w:tcBorders>
+          </w:tcPr>
+          <w:p>
+            <w:pPr>
+              <w:keepNext/>
+              <w:spacing w:before="30" w:after="30"/>
+              <w:jc w:val="center"/>
+            </w:pPr>
+            <w:r>
+              <w:rPr>
+                <w:sz w:val="18"/>
+              </w:rPr>
+              <w:t>+0.182</w:t>
+            </w:r>
+          </w:p>
+        </w:tc>
+        <w:tc>
+          <w:tcPr>
+            <w:tcW w:w="2948" w:type="dxa"/>
+            <w:tcBorders>
+              <w:left w:val="nil"/>
+              <w:bottom w:val="nil"/>
+              <w:right w:val="nil"/>
+            </w:tcBorders>
+          </w:tcPr>
+          <w:p>
+            <w:pPr>
+              <w:keepNext/>
+              <w:spacing w:before="30" w:after="30"/>
+              <w:jc w:val="center"/>
+            </w:pPr>
+            <w:r>
+              <w:rPr>
+                <w:sz w:val="18"/>
+              </w:rPr>
+              <w:t>+0.138</w:t>
+            </w:r>
+          </w:p>
+        </w:tc>
+      </w:tr>
+      <w:tr>
+        <w:trPr>
+          <w:jc w:val="center"/>
+        </w:trPr>
+        <w:tc>
+          <w:tcPr>
+            <w:tcW w:w="3742" w:type="dxa"/>
+            <w:tcBorders>
+              <w:left w:val="nil"/>
+              <w:bottom w:val="nil"/>
+              <w:right w:val="nil"/>
+            </w:tcBorders>
+          </w:tcPr>
+          <w:p>
+            <w:pPr>
+              <w:keepNext/>
+              <w:spacing w:before="30" w:after="30"/>
+            </w:pPr>
+            <w:r>
+              <w:rPr>
+                <w:sz w:val="18"/>
+              </w:rPr>
+              <w:t xml:space="preserve">    차이의 95% 신뢰구간</w:t>
+            </w:r>
+          </w:p>
+        </w:tc>
+        <w:tc>
+          <w:tcPr>
+            <w:tcW w:w="2948" w:type="dxa"/>
+            <w:tcBorders>
+              <w:left w:val="nil"/>
+              <w:bottom w:val="nil"/>
+              <w:right w:val="nil"/>
+            </w:tcBorders>
+          </w:tcPr>
+          <w:p>
+            <w:pPr>
+              <w:keepNext/>
+              <w:spacing w:before="30" w:after="30"/>
+              <w:jc w:val="center"/>
+            </w:pPr>
+            <w:r>
+              <w:rPr>
+                <w:sz w:val="18"/>
+              </w:rPr>
+              <w:t>[−0.282, +0.649]</w:t>
+            </w:r>
+          </w:p>
+        </w:tc>
+        <w:tc>
+          <w:tcPr>
+            <w:tcW w:w="2948" w:type="dxa"/>
+            <w:tcBorders>
+              <w:left w:val="nil"/>
+              <w:bottom w:val="nil"/>
+              <w:right w:val="nil"/>
+            </w:tcBorders>
+          </w:tcPr>
+          <w:p>
+            <w:pPr>
+              <w:keepNext/>
+              <w:spacing w:before="30" w:after="30"/>
+              <w:jc w:val="center"/>
+            </w:pPr>
+            <w:r>
+              <w:rPr>
+                <w:sz w:val="18"/>
+              </w:rPr>
+              <w:t>[−0.321, +0.599]</w:t>
             </w:r>
           </w:p>
         </w:tc>
@@ -1282,7 +1428,7 @@
           <w:sz w:val="16"/>
           <w:lang w:eastAsia="ko-KR"/>
         </w:rPr>
-        <w:t>[95% 구간]은 기업 단위 대응 차이의 평균에 대한 비모수 부트스트랩 백분위수 신뢰구간이다(53개 기업 복원추출, 10,000회). 구간이 0을 포함하면 유의수준 5%에서 차이가 통계적으로 유의하지 않다. 참고: 모든 기업에 비용 절감을 적용한 경우 +0.546, 강화학습 정책(C3-E) +0.755, 무작위 +0.269. 단일 후보 3개 기업은 모든 정책의 점수가 +0.768로 같다.</w:t>
+        <w:t>95% 신뢰구간은 기업 단위 대응 차이의 평균에 대한 비모수 부트스트랩 백분위수 신뢰구간이다(53개 기업 복원추출, 10,000회). 구간이 0을 포함하면 유의수준 5%에서 차이가 통계적으로 유의하지 않다. 참고: 모든 기업에 비용 절감을 적용한 경우 +0.546, 강화학습 정책(C3-E) +0.755, 무작위 +0.269. 단일 후보 3개 기업은 모든 정책의 점수가 +0.768로 같다.</w:t>
       </w:r>
     </w:p>
     <w:p>

</xml_diff>